<commit_message>
Deploy: formularul documentului de fundamentare dupa documentele reale
Co-Authored-By: Claude Opus 5 <noreply@anthropic.com>
Claude-Session: https://claude.ai/code/session_01ApLve1RojwZeV1BmfyeSQ6
</commit_message>
<xml_diff>
--- a/sabloane/fundamentare.docx
+++ b/sabloane/fundamentare.docx
@@ -406,7 +406,7 @@
           <w:lang w:val="ro-RO"/>
           <w14:ligatures w14:val="none"/>
         </w:rPr>
-        <w:t xml:space="preserve">2. Descrierea pe scurt a obiectului documentului de fundamentare/motivul revizuirii {{obiect}}</w:t>
+        <w:t xml:space="preserve">2. Descrierea pe scurt a obiectului documentului de fundamentare/motivul revizuirii {{descriere_scurta}}</w:t>
       </w:r>
       <w:r>
         <w:rPr>
@@ -2166,7 +2166,7 @@
           <w:szCs w:val="24"/>
           <w14:ligatures w14:val="none"/>
         </w:rPr>
-        <w:t xml:space="preserve">[ ] rămâne în sumă de .................   lei, conform fundamentării aprobate într-o revizuire anterioară a prezentului document de fundamentare.</w:t>
+        <w:t xml:space="preserve">[ ] rămâne în sumă de {{ramane}}   lei, conform fundamentării aprobate într-o revizuire anterioară a prezentului document de fundamentare.</w:t>
       </w:r>
       <w:r>
         <w:rPr>

</xml_diff>